<commit_message>
Rename index to manuscript, add SI links to ms, fix link formatting.
</commit_message>
<xml_diff>
--- a/manuscript/styles/db-space-line-n.docx
+++ b/manuscript/styles/db-space-line-n.docx
@@ -781,6 +781,35 @@
     <w:semiHidden/>
     <w:unhideWhenUsed/>
   </w:style>
+  <w:style w:type="character" w:styleId="VerbatimChar">
+    <w:name w:val="Verbatim Char"/>
+    <w:basedOn w:val="DefaultParagraphFont"/>
+    <w:rPr>
+      <w:rFonts w:ascii="Aptos Mono" w:hAnsi="Aptos Mono" w:cs="Aptos Mono"/>
+      <w:sz w:val="19"/>
+      <w:shd w:val="clear" w:fill="F8F9FA"/>
+    </w:rPr>
+  </w:style>
+  <w:style w:type="paragraph" w:styleId="SourceCode">
+    <w:name w:val="Source Code"/>
+    <w:basedOn w:val="Normal"/>
+    <w:link w:val="VerbatimChar"/>
+    <w:pPr>
+      <w:shd w:val="clear" w:fill="F8F9FA"/>
+      <w:spacing w:before="120" w:after="120" w:line="240" w:lineRule="auto"/>
+      <w:ind w:left="144" w:right="144"/>
+    </w:pPr>
+  </w:style>
+  <w:style w:type="character" w:styleId="Hyperlink">
+    <w:name w:val="Hyperlink"/>
+    <w:basedOn w:val="DefaultParagraphFont"/>
+    <w:uiPriority w:val="99"/>
+    <w:unhideWhenUsed/>
+    <w:rPr>
+      <w:color w:val="0563C1"/>
+      <w:u w:val="single"/>
+    </w:rPr>
+  </w:style>
   <w:style w:type="table" w:default="1" w:styleId="TableNormal">
     <w:name w:val="Normal Table"/>
     <w:uiPriority w:val="99"/>

</xml_diff>